<commit_message>
update docs: .sql and SRS
</commit_message>
<xml_diff>
--- a/docs/SRS.docx
+++ b/docs/SRS.docx
@@ -3776,6 +3776,7 @@
           <w:rFonts w:ascii="Times New Roman" w:hAnsi="Times New Roman" w:cs="Times New Roman"/>
           <w:sz w:val="28"/>
           <w:szCs w:val="28"/>
+          <w:lang w:val="en-US"/>
         </w:rPr>
       </w:pPr>
       <w:r>
@@ -3786,6 +3787,100 @@
         </w:rPr>
         <w:t>Отметка. Одно или все как прочитанные.</w:t>
       </w:r>
+      <w:r>
+        <w:rPr>
+          <w:rFonts w:ascii="Times New Roman" w:hAnsi="Times New Roman" w:cs="Times New Roman"/>
+          <w:sz w:val="28"/>
+          <w:szCs w:val="28"/>
+        </w:rPr>
+        <w:t xml:space="preserve"> </w:t>
+      </w:r>
+    </w:p>
+    <w:p>
+      <w:pPr>
+        <w:spacing w:after="0" w:line="360" w:lineRule="auto"/>
+        <w:ind w:firstLine="709"/>
+        <w:jc w:val="both"/>
+        <w:rPr>
+          <w:rFonts w:ascii="Times New Roman" w:hAnsi="Times New Roman" w:cs="Times New Roman"/>
+          <w:sz w:val="28"/>
+          <w:szCs w:val="28"/>
+        </w:rPr>
+      </w:pPr>
+      <w:r>
+        <w:rPr>
+          <w:rFonts w:ascii="Times New Roman" w:hAnsi="Times New Roman" w:cs="Times New Roman"/>
+          <w:sz w:val="28"/>
+          <w:szCs w:val="28"/>
+        </w:rPr>
+        <w:t>При</w:t>
+      </w:r>
+      <w:r>
+        <w:rPr>
+          <w:rFonts w:ascii="Times New Roman" w:hAnsi="Times New Roman" w:cs="Times New Roman"/>
+          <w:sz w:val="28"/>
+          <w:szCs w:val="28"/>
+        </w:rPr>
+        <w:t xml:space="preserve"> /</w:t>
+      </w:r>
+      <w:r>
+        <w:rPr>
+          <w:rFonts w:ascii="Times New Roman" w:hAnsi="Times New Roman" w:cs="Times New Roman"/>
+          <w:sz w:val="28"/>
+          <w:szCs w:val="28"/>
+          <w:lang w:val="en-US"/>
+        </w:rPr>
+        <w:t>login</w:t>
+      </w:r>
+      <w:r>
+        <w:rPr>
+          <w:rFonts w:ascii="Times New Roman" w:hAnsi="Times New Roman" w:cs="Times New Roman"/>
+          <w:sz w:val="28"/>
+          <w:szCs w:val="28"/>
+        </w:rPr>
+        <w:t xml:space="preserve"> </w:t>
+      </w:r>
+      <w:r>
+        <w:rPr>
+          <w:rFonts w:ascii="Times New Roman" w:hAnsi="Times New Roman" w:cs="Times New Roman"/>
+          <w:sz w:val="28"/>
+          <w:szCs w:val="28"/>
+        </w:rPr>
+        <w:t>подключается</w:t>
+      </w:r>
+      <w:r>
+        <w:rPr>
+          <w:rFonts w:ascii="Times New Roman" w:hAnsi="Times New Roman" w:cs="Times New Roman"/>
+          <w:sz w:val="28"/>
+          <w:szCs w:val="28"/>
+        </w:rPr>
+        <w:t xml:space="preserve"> </w:t>
+      </w:r>
+      <w:r>
+        <w:rPr>
+          <w:rFonts w:ascii="Times New Roman" w:hAnsi="Times New Roman" w:cs="Times New Roman"/>
+          <w:sz w:val="28"/>
+          <w:szCs w:val="28"/>
+          <w:lang w:val="en-US"/>
+        </w:rPr>
+        <w:t>WebSocket</w:t>
+      </w:r>
+      <w:r>
+        <w:rPr>
+          <w:rFonts w:ascii="Times New Roman" w:hAnsi="Times New Roman" w:cs="Times New Roman"/>
+          <w:sz w:val="28"/>
+          <w:szCs w:val="28"/>
+        </w:rPr>
+        <w:t xml:space="preserve"> </w:t>
+      </w:r>
+      <w:r>
+        <w:rPr>
+          <w:rFonts w:ascii="Times New Roman" w:hAnsi="Times New Roman" w:cs="Times New Roman"/>
+          <w:sz w:val="28"/>
+          <w:szCs w:val="28"/>
+        </w:rPr>
+        <w:t>Реальное время</w:t>
+      </w:r>
     </w:p>
     <w:p>
       <w:pPr>
@@ -3793,7 +3888,13 @@
       </w:pPr>
       <w:bookmarkStart w:id="28" w:name="_Toc240553336"/>
       <w:r>
-        <w:t>4.2.9. Подсистема администрирования</w:t>
+        <w:rPr>
+          <w:lang w:val="en-US"/>
+        </w:rPr>
+        <w:t xml:space="preserve">4.2.9. </w:t>
+      </w:r>
+      <w:r>
+        <w:t>Подсистема администрирования</w:t>
       </w:r>
       <w:bookmarkEnd w:id="28"/>
     </w:p>
@@ -4086,17 +4187,15 @@
         </w:rPr>
         <w:t xml:space="preserve"> </w:t>
       </w:r>
-      <w:proofErr w:type="spellStart"/>
-      <w:r>
-        <w:rPr>
-          <w:rFonts w:ascii="Times New Roman" w:hAnsi="Times New Roman" w:cs="Times New Roman"/>
-          <w:sz w:val="28"/>
-          <w:szCs w:val="28"/>
-          <w:lang w:val="en-US"/>
-        </w:rPr>
-        <w:t>bcrypt</w:t>
-      </w:r>
-      <w:proofErr w:type="spellEnd"/>
+      <w:r>
+        <w:rPr>
+          <w:rFonts w:ascii="Times New Roman" w:hAnsi="Times New Roman" w:cs="Times New Roman"/>
+          <w:sz w:val="28"/>
+          <w:szCs w:val="28"/>
+          <w:lang w:val="en-US"/>
+        </w:rPr>
+        <w:t>argon2</w:t>
+      </w:r>
       <w:r>
         <w:rPr>
           <w:rFonts w:ascii="Times New Roman" w:hAnsi="Times New Roman" w:cs="Times New Roman"/>
@@ -6111,28 +6210,6 @@
           <w:lang w:val="en-US"/>
         </w:rPr>
         <w:t xml:space="preserve"> Continuous Delivery.</w:t>
-      </w:r>
-    </w:p>
-    <w:p>
-      <w:pPr>
-        <w:spacing w:after="0" w:line="360" w:lineRule="auto"/>
-        <w:ind w:firstLine="709"/>
-        <w:jc w:val="both"/>
-        <w:rPr>
-          <w:rFonts w:ascii="Times New Roman" w:hAnsi="Times New Roman" w:cs="Times New Roman"/>
-          <w:sz w:val="28"/>
-          <w:szCs w:val="28"/>
-          <w:lang w:val="en-US"/>
-        </w:rPr>
-      </w:pPr>
-      <w:r>
-        <w:rPr>
-          <w:rFonts w:ascii="Times New Roman" w:hAnsi="Times New Roman" w:cs="Times New Roman"/>
-          <w:sz w:val="28"/>
-          <w:szCs w:val="28"/>
-          <w:lang w:val="en-US"/>
-        </w:rPr>
-        <w:t>DAO — Data Access Object.</w:t>
       </w:r>
     </w:p>
     <w:p>
@@ -8599,23 +8676,7 @@
                 <w:rFonts w:ascii="Times New Roman" w:hAnsi="Times New Roman" w:cs="Times New Roman"/>
                 <w:noProof/>
               </w:rPr>
-              <w:t>5. ТРЕБ</w:t>
-            </w:r>
-            <w:r>
-              <w:rPr>
-                <w:rStyle w:val="af6"/>
-                <w:rFonts w:ascii="Times New Roman" w:hAnsi="Times New Roman" w:cs="Times New Roman"/>
-                <w:noProof/>
-              </w:rPr>
-              <w:t>О</w:t>
-            </w:r>
-            <w:r>
-              <w:rPr>
-                <w:rStyle w:val="af6"/>
-                <w:rFonts w:ascii="Times New Roman" w:hAnsi="Times New Roman" w:cs="Times New Roman"/>
-                <w:noProof/>
-              </w:rPr>
-              <w:t>ВАНИЯ К ПРОГРАММНОМУ ОБЕСПЕЧЕНИЮ</w:t>
+              <w:t>5. ТРЕБОВАНИЯ К ПРОГРАММНОМУ ОБЕСПЕЧЕНИЮ</w:t>
             </w:r>
             <w:r>
               <w:rPr>

</xml_diff>

<commit_message>
update srs: remove sqllite
</commit_message>
<xml_diff>
--- a/docs/SRS.docx
+++ b/docs/SRS.docx
@@ -2187,7 +2187,27 @@
           <w:sz w:val="28"/>
           <w:szCs w:val="28"/>
         </w:rPr>
-        <w:t xml:space="preserve"> (продакшен), </w:t>
+        <w:t xml:space="preserve"> (продакшен)</w:t>
+      </w:r>
+    </w:p>
+    <w:p>
+      <w:pPr>
+        <w:spacing w:after="0" w:line="360" w:lineRule="auto"/>
+        <w:ind w:firstLine="709"/>
+        <w:jc w:val="both"/>
+        <w:rPr>
+          <w:rFonts w:ascii="Times New Roman" w:hAnsi="Times New Roman" w:cs="Times New Roman"/>
+          <w:sz w:val="28"/>
+          <w:szCs w:val="28"/>
+        </w:rPr>
+      </w:pPr>
+      <w:r>
+        <w:rPr>
+          <w:rFonts w:ascii="Times New Roman" w:hAnsi="Times New Roman" w:cs="Times New Roman"/>
+          <w:sz w:val="28"/>
+          <w:szCs w:val="28"/>
+        </w:rPr>
+        <w:t xml:space="preserve">Кэш и очереди — </w:t>
       </w:r>
       <w:proofErr w:type="spellStart"/>
       <w:r>
@@ -2196,7 +2216,7 @@
           <w:sz w:val="28"/>
           <w:szCs w:val="28"/>
         </w:rPr>
-        <w:t>SQLite</w:t>
+        <w:t>Redis</w:t>
       </w:r>
       <w:proofErr w:type="spellEnd"/>
       <w:r>
@@ -2205,27 +2225,7 @@
           <w:sz w:val="28"/>
           <w:szCs w:val="28"/>
         </w:rPr>
-        <w:t xml:space="preserve"> (разработка).</w:t>
-      </w:r>
-    </w:p>
-    <w:p>
-      <w:pPr>
-        <w:spacing w:after="0" w:line="360" w:lineRule="auto"/>
-        <w:ind w:firstLine="709"/>
-        <w:jc w:val="both"/>
-        <w:rPr>
-          <w:rFonts w:ascii="Times New Roman" w:hAnsi="Times New Roman" w:cs="Times New Roman"/>
-          <w:sz w:val="28"/>
-          <w:szCs w:val="28"/>
-        </w:rPr>
-      </w:pPr>
-      <w:r>
-        <w:rPr>
-          <w:rFonts w:ascii="Times New Roman" w:hAnsi="Times New Roman" w:cs="Times New Roman"/>
-          <w:sz w:val="28"/>
-          <w:szCs w:val="28"/>
-        </w:rPr>
-        <w:t xml:space="preserve">Кэш и очереди — </w:t>
+        <w:t xml:space="preserve"> и </w:t>
       </w:r>
       <w:proofErr w:type="spellStart"/>
       <w:r>
@@ -2234,7 +2234,7 @@
           <w:sz w:val="28"/>
           <w:szCs w:val="28"/>
         </w:rPr>
-        <w:t>Redis</w:t>
+        <w:t>Celery</w:t>
       </w:r>
       <w:proofErr w:type="spellEnd"/>
       <w:r>
@@ -2243,6 +2243,192 @@
           <w:sz w:val="28"/>
           <w:szCs w:val="28"/>
         </w:rPr>
+        <w:t>.</w:t>
+      </w:r>
+    </w:p>
+    <w:p>
+      <w:pPr>
+        <w:pStyle w:val="xxx"/>
+      </w:pPr>
+      <w:bookmarkStart w:id="17" w:name="_Toc240553325"/>
+      <w:r>
+        <w:t>4.1.2. Требования к надёжности</w:t>
+      </w:r>
+      <w:bookmarkEnd w:id="17"/>
+    </w:p>
+    <w:p>
+      <w:pPr>
+        <w:spacing w:after="0" w:line="360" w:lineRule="auto"/>
+        <w:ind w:firstLine="709"/>
+        <w:jc w:val="both"/>
+        <w:rPr>
+          <w:rFonts w:ascii="Times New Roman" w:hAnsi="Times New Roman" w:cs="Times New Roman"/>
+          <w:sz w:val="28"/>
+          <w:szCs w:val="28"/>
+        </w:rPr>
+      </w:pPr>
+      <w:r>
+        <w:rPr>
+          <w:rFonts w:ascii="Times New Roman" w:hAnsi="Times New Roman" w:cs="Times New Roman"/>
+          <w:sz w:val="28"/>
+          <w:szCs w:val="28"/>
+        </w:rPr>
+        <w:t xml:space="preserve">- </w:t>
+      </w:r>
+      <w:r>
+        <w:rPr>
+          <w:rFonts w:ascii="Times New Roman" w:hAnsi="Times New Roman" w:cs="Times New Roman"/>
+          <w:sz w:val="28"/>
+          <w:szCs w:val="28"/>
+        </w:rPr>
+        <w:t>Автоматический перезапуск контейнеров при падении.</w:t>
+      </w:r>
+    </w:p>
+    <w:p>
+      <w:pPr>
+        <w:spacing w:after="0" w:line="360" w:lineRule="auto"/>
+        <w:ind w:firstLine="709"/>
+        <w:jc w:val="both"/>
+        <w:rPr>
+          <w:rFonts w:ascii="Times New Roman" w:hAnsi="Times New Roman" w:cs="Times New Roman"/>
+          <w:sz w:val="28"/>
+          <w:szCs w:val="28"/>
+        </w:rPr>
+      </w:pPr>
+      <w:r>
+        <w:rPr>
+          <w:rFonts w:ascii="Times New Roman" w:hAnsi="Times New Roman" w:cs="Times New Roman"/>
+          <w:sz w:val="28"/>
+          <w:szCs w:val="28"/>
+        </w:rPr>
+        <w:t xml:space="preserve">- </w:t>
+      </w:r>
+      <w:proofErr w:type="spellStart"/>
+      <w:r>
+        <w:rPr>
+          <w:rFonts w:ascii="Times New Roman" w:hAnsi="Times New Roman" w:cs="Times New Roman"/>
+          <w:sz w:val="28"/>
+          <w:szCs w:val="28"/>
+        </w:rPr>
+        <w:t>Healthcheck</w:t>
+      </w:r>
+      <w:proofErr w:type="spellEnd"/>
+      <w:r>
+        <w:rPr>
+          <w:rFonts w:ascii="Times New Roman" w:hAnsi="Times New Roman" w:cs="Times New Roman"/>
+          <w:sz w:val="28"/>
+          <w:szCs w:val="28"/>
+        </w:rPr>
+        <w:t xml:space="preserve"> для каждого сервиса.</w:t>
+      </w:r>
+    </w:p>
+    <w:p>
+      <w:pPr>
+        <w:spacing w:after="0" w:line="360" w:lineRule="auto"/>
+        <w:ind w:firstLine="709"/>
+        <w:jc w:val="both"/>
+        <w:rPr>
+          <w:rFonts w:ascii="Times New Roman" w:hAnsi="Times New Roman" w:cs="Times New Roman"/>
+          <w:sz w:val="28"/>
+          <w:szCs w:val="28"/>
+        </w:rPr>
+      </w:pPr>
+      <w:r>
+        <w:rPr>
+          <w:rFonts w:ascii="Times New Roman" w:hAnsi="Times New Roman" w:cs="Times New Roman"/>
+          <w:sz w:val="28"/>
+          <w:szCs w:val="28"/>
+        </w:rPr>
+        <w:t xml:space="preserve">- </w:t>
+      </w:r>
+      <w:r>
+        <w:rPr>
+          <w:rFonts w:ascii="Times New Roman" w:hAnsi="Times New Roman" w:cs="Times New Roman"/>
+          <w:sz w:val="28"/>
+          <w:szCs w:val="28"/>
+        </w:rPr>
+        <w:t>Централизованное логирование (</w:t>
+      </w:r>
+      <w:proofErr w:type="spellStart"/>
+      <w:r>
+        <w:rPr>
+          <w:rFonts w:ascii="Times New Roman" w:hAnsi="Times New Roman" w:cs="Times New Roman"/>
+          <w:sz w:val="28"/>
+          <w:szCs w:val="28"/>
+        </w:rPr>
+        <w:t>Loki</w:t>
+      </w:r>
+      <w:proofErr w:type="spellEnd"/>
+      <w:r>
+        <w:rPr>
+          <w:rFonts w:ascii="Times New Roman" w:hAnsi="Times New Roman" w:cs="Times New Roman"/>
+          <w:sz w:val="28"/>
+          <w:szCs w:val="28"/>
+        </w:rPr>
+        <w:t xml:space="preserve"> или ELK).</w:t>
+      </w:r>
+    </w:p>
+    <w:p>
+      <w:pPr>
+        <w:spacing w:after="0" w:line="360" w:lineRule="auto"/>
+        <w:ind w:firstLine="709"/>
+        <w:jc w:val="both"/>
+        <w:rPr>
+          <w:rFonts w:ascii="Times New Roman" w:hAnsi="Times New Roman" w:cs="Times New Roman"/>
+          <w:sz w:val="28"/>
+          <w:szCs w:val="28"/>
+        </w:rPr>
+      </w:pPr>
+      <w:r>
+        <w:rPr>
+          <w:rFonts w:ascii="Times New Roman" w:hAnsi="Times New Roman" w:cs="Times New Roman"/>
+          <w:sz w:val="28"/>
+          <w:szCs w:val="28"/>
+        </w:rPr>
+        <w:t xml:space="preserve">- </w:t>
+      </w:r>
+      <w:r>
+        <w:rPr>
+          <w:rFonts w:ascii="Times New Roman" w:hAnsi="Times New Roman" w:cs="Times New Roman"/>
+          <w:sz w:val="28"/>
+          <w:szCs w:val="28"/>
+        </w:rPr>
+        <w:t xml:space="preserve">Мониторинг и </w:t>
+      </w:r>
+      <w:proofErr w:type="spellStart"/>
+      <w:r>
+        <w:rPr>
+          <w:rFonts w:ascii="Times New Roman" w:hAnsi="Times New Roman" w:cs="Times New Roman"/>
+          <w:sz w:val="28"/>
+          <w:szCs w:val="28"/>
+        </w:rPr>
+        <w:t>алертинг</w:t>
+      </w:r>
+      <w:proofErr w:type="spellEnd"/>
+      <w:r>
+        <w:rPr>
+          <w:rFonts w:ascii="Times New Roman" w:hAnsi="Times New Roman" w:cs="Times New Roman"/>
+          <w:sz w:val="28"/>
+          <w:szCs w:val="28"/>
+        </w:rPr>
+        <w:t xml:space="preserve"> (</w:t>
+      </w:r>
+      <w:proofErr w:type="spellStart"/>
+      <w:r>
+        <w:rPr>
+          <w:rFonts w:ascii="Times New Roman" w:hAnsi="Times New Roman" w:cs="Times New Roman"/>
+          <w:sz w:val="28"/>
+          <w:szCs w:val="28"/>
+        </w:rPr>
+        <w:t>Prometheus</w:t>
+      </w:r>
+      <w:proofErr w:type="spellEnd"/>
+      <w:r>
+        <w:rPr>
+          <w:rFonts w:ascii="Times New Roman" w:hAnsi="Times New Roman" w:cs="Times New Roman"/>
+          <w:sz w:val="28"/>
+          <w:szCs w:val="28"/>
+        </w:rPr>
         <w:t xml:space="preserve"> и </w:t>
       </w:r>
       <w:proofErr w:type="spellStart"/>
@@ -2252,7 +2438,7 @@
           <w:sz w:val="28"/>
           <w:szCs w:val="28"/>
         </w:rPr>
-        <w:t>Celery</w:t>
+        <w:t>Grafana</w:t>
       </w:r>
       <w:proofErr w:type="spellEnd"/>
       <w:r>
@@ -2261,18 +2447,18 @@
           <w:sz w:val="28"/>
           <w:szCs w:val="28"/>
         </w:rPr>
-        <w:t>.</w:t>
+        <w:t>).</w:t>
       </w:r>
     </w:p>
     <w:p>
       <w:pPr>
         <w:pStyle w:val="xxx"/>
       </w:pPr>
-      <w:bookmarkStart w:id="17" w:name="_Toc240553325"/>
-      <w:r>
-        <w:t>4.1.2. Требования к надёжности</w:t>
-      </w:r>
-      <w:bookmarkEnd w:id="17"/>
+      <w:bookmarkStart w:id="18" w:name="_Toc240553326"/>
+      <w:r>
+        <w:t>4.1.3. Требования к безопасности</w:t>
+      </w:r>
+      <w:bookmarkEnd w:id="18"/>
     </w:p>
     <w:p>
       <w:pPr>
@@ -2299,7 +2485,43 @@
           <w:sz w:val="28"/>
           <w:szCs w:val="28"/>
         </w:rPr>
-        <w:t>Автоматический перезапуск контейнеров при падении.</w:t>
+        <w:t>JWT-аутентификация (</w:t>
+      </w:r>
+      <w:proofErr w:type="spellStart"/>
+      <w:r>
+        <w:rPr>
+          <w:rFonts w:ascii="Times New Roman" w:hAnsi="Times New Roman" w:cs="Times New Roman"/>
+          <w:sz w:val="28"/>
+          <w:szCs w:val="28"/>
+        </w:rPr>
+        <w:t>access</w:t>
+      </w:r>
+      <w:proofErr w:type="spellEnd"/>
+      <w:r>
+        <w:rPr>
+          <w:rFonts w:ascii="Times New Roman" w:hAnsi="Times New Roman" w:cs="Times New Roman"/>
+          <w:sz w:val="28"/>
+          <w:szCs w:val="28"/>
+        </w:rPr>
+        <w:t xml:space="preserve"> и </w:t>
+      </w:r>
+      <w:proofErr w:type="spellStart"/>
+      <w:r>
+        <w:rPr>
+          <w:rFonts w:ascii="Times New Roman" w:hAnsi="Times New Roman" w:cs="Times New Roman"/>
+          <w:sz w:val="28"/>
+          <w:szCs w:val="28"/>
+        </w:rPr>
+        <w:t>refresh</w:t>
+      </w:r>
+      <w:proofErr w:type="spellEnd"/>
+      <w:r>
+        <w:rPr>
+          <w:rFonts w:ascii="Times New Roman" w:hAnsi="Times New Roman" w:cs="Times New Roman"/>
+          <w:sz w:val="28"/>
+          <w:szCs w:val="28"/>
+        </w:rPr>
+        <w:t xml:space="preserve"> токены).</w:t>
       </w:r>
     </w:p>
     <w:p>
@@ -2321,246 +2543,6 @@
         </w:rPr>
         <w:t xml:space="preserve">- </w:t>
       </w:r>
-      <w:proofErr w:type="spellStart"/>
-      <w:r>
-        <w:rPr>
-          <w:rFonts w:ascii="Times New Roman" w:hAnsi="Times New Roman" w:cs="Times New Roman"/>
-          <w:sz w:val="28"/>
-          <w:szCs w:val="28"/>
-        </w:rPr>
-        <w:t>Healthcheck</w:t>
-      </w:r>
-      <w:proofErr w:type="spellEnd"/>
-      <w:r>
-        <w:rPr>
-          <w:rFonts w:ascii="Times New Roman" w:hAnsi="Times New Roman" w:cs="Times New Roman"/>
-          <w:sz w:val="28"/>
-          <w:szCs w:val="28"/>
-        </w:rPr>
-        <w:t xml:space="preserve"> для каждого сервиса.</w:t>
-      </w:r>
-    </w:p>
-    <w:p>
-      <w:pPr>
-        <w:spacing w:after="0" w:line="360" w:lineRule="auto"/>
-        <w:ind w:firstLine="709"/>
-        <w:jc w:val="both"/>
-        <w:rPr>
-          <w:rFonts w:ascii="Times New Roman" w:hAnsi="Times New Roman" w:cs="Times New Roman"/>
-          <w:sz w:val="28"/>
-          <w:szCs w:val="28"/>
-        </w:rPr>
-      </w:pPr>
-      <w:r>
-        <w:rPr>
-          <w:rFonts w:ascii="Times New Roman" w:hAnsi="Times New Roman" w:cs="Times New Roman"/>
-          <w:sz w:val="28"/>
-          <w:szCs w:val="28"/>
-        </w:rPr>
-        <w:t xml:space="preserve">- </w:t>
-      </w:r>
-      <w:r>
-        <w:rPr>
-          <w:rFonts w:ascii="Times New Roman" w:hAnsi="Times New Roman" w:cs="Times New Roman"/>
-          <w:sz w:val="28"/>
-          <w:szCs w:val="28"/>
-        </w:rPr>
-        <w:t>Централизованное логирование (</w:t>
-      </w:r>
-      <w:proofErr w:type="spellStart"/>
-      <w:r>
-        <w:rPr>
-          <w:rFonts w:ascii="Times New Roman" w:hAnsi="Times New Roman" w:cs="Times New Roman"/>
-          <w:sz w:val="28"/>
-          <w:szCs w:val="28"/>
-        </w:rPr>
-        <w:t>Loki</w:t>
-      </w:r>
-      <w:proofErr w:type="spellEnd"/>
-      <w:r>
-        <w:rPr>
-          <w:rFonts w:ascii="Times New Roman" w:hAnsi="Times New Roman" w:cs="Times New Roman"/>
-          <w:sz w:val="28"/>
-          <w:szCs w:val="28"/>
-        </w:rPr>
-        <w:t xml:space="preserve"> или ELK).</w:t>
-      </w:r>
-    </w:p>
-    <w:p>
-      <w:pPr>
-        <w:spacing w:after="0" w:line="360" w:lineRule="auto"/>
-        <w:ind w:firstLine="709"/>
-        <w:jc w:val="both"/>
-        <w:rPr>
-          <w:rFonts w:ascii="Times New Roman" w:hAnsi="Times New Roman" w:cs="Times New Roman"/>
-          <w:sz w:val="28"/>
-          <w:szCs w:val="28"/>
-        </w:rPr>
-      </w:pPr>
-      <w:r>
-        <w:rPr>
-          <w:rFonts w:ascii="Times New Roman" w:hAnsi="Times New Roman" w:cs="Times New Roman"/>
-          <w:sz w:val="28"/>
-          <w:szCs w:val="28"/>
-        </w:rPr>
-        <w:t xml:space="preserve">- </w:t>
-      </w:r>
-      <w:r>
-        <w:rPr>
-          <w:rFonts w:ascii="Times New Roman" w:hAnsi="Times New Roman" w:cs="Times New Roman"/>
-          <w:sz w:val="28"/>
-          <w:szCs w:val="28"/>
-        </w:rPr>
-        <w:t xml:space="preserve">Мониторинг и </w:t>
-      </w:r>
-      <w:proofErr w:type="spellStart"/>
-      <w:r>
-        <w:rPr>
-          <w:rFonts w:ascii="Times New Roman" w:hAnsi="Times New Roman" w:cs="Times New Roman"/>
-          <w:sz w:val="28"/>
-          <w:szCs w:val="28"/>
-        </w:rPr>
-        <w:t>алертинг</w:t>
-      </w:r>
-      <w:proofErr w:type="spellEnd"/>
-      <w:r>
-        <w:rPr>
-          <w:rFonts w:ascii="Times New Roman" w:hAnsi="Times New Roman" w:cs="Times New Roman"/>
-          <w:sz w:val="28"/>
-          <w:szCs w:val="28"/>
-        </w:rPr>
-        <w:t xml:space="preserve"> (</w:t>
-      </w:r>
-      <w:proofErr w:type="spellStart"/>
-      <w:r>
-        <w:rPr>
-          <w:rFonts w:ascii="Times New Roman" w:hAnsi="Times New Roman" w:cs="Times New Roman"/>
-          <w:sz w:val="28"/>
-          <w:szCs w:val="28"/>
-        </w:rPr>
-        <w:t>Prometheus</w:t>
-      </w:r>
-      <w:proofErr w:type="spellEnd"/>
-      <w:r>
-        <w:rPr>
-          <w:rFonts w:ascii="Times New Roman" w:hAnsi="Times New Roman" w:cs="Times New Roman"/>
-          <w:sz w:val="28"/>
-          <w:szCs w:val="28"/>
-        </w:rPr>
-        <w:t xml:space="preserve"> и </w:t>
-      </w:r>
-      <w:proofErr w:type="spellStart"/>
-      <w:r>
-        <w:rPr>
-          <w:rFonts w:ascii="Times New Roman" w:hAnsi="Times New Roman" w:cs="Times New Roman"/>
-          <w:sz w:val="28"/>
-          <w:szCs w:val="28"/>
-        </w:rPr>
-        <w:t>Grafana</w:t>
-      </w:r>
-      <w:proofErr w:type="spellEnd"/>
-      <w:r>
-        <w:rPr>
-          <w:rFonts w:ascii="Times New Roman" w:hAnsi="Times New Roman" w:cs="Times New Roman"/>
-          <w:sz w:val="28"/>
-          <w:szCs w:val="28"/>
-        </w:rPr>
-        <w:t>).</w:t>
-      </w:r>
-    </w:p>
-    <w:p>
-      <w:pPr>
-        <w:pStyle w:val="xxx"/>
-      </w:pPr>
-      <w:bookmarkStart w:id="18" w:name="_Toc240553326"/>
-      <w:r>
-        <w:t>4.1.3. Требования к безопасности</w:t>
-      </w:r>
-      <w:bookmarkEnd w:id="18"/>
-    </w:p>
-    <w:p>
-      <w:pPr>
-        <w:spacing w:after="0" w:line="360" w:lineRule="auto"/>
-        <w:ind w:firstLine="709"/>
-        <w:jc w:val="both"/>
-        <w:rPr>
-          <w:rFonts w:ascii="Times New Roman" w:hAnsi="Times New Roman" w:cs="Times New Roman"/>
-          <w:sz w:val="28"/>
-          <w:szCs w:val="28"/>
-        </w:rPr>
-      </w:pPr>
-      <w:r>
-        <w:rPr>
-          <w:rFonts w:ascii="Times New Roman" w:hAnsi="Times New Roman" w:cs="Times New Roman"/>
-          <w:sz w:val="28"/>
-          <w:szCs w:val="28"/>
-        </w:rPr>
-        <w:t xml:space="preserve">- </w:t>
-      </w:r>
-      <w:r>
-        <w:rPr>
-          <w:rFonts w:ascii="Times New Roman" w:hAnsi="Times New Roman" w:cs="Times New Roman"/>
-          <w:sz w:val="28"/>
-          <w:szCs w:val="28"/>
-        </w:rPr>
-        <w:t>JWT-аутентификация (</w:t>
-      </w:r>
-      <w:proofErr w:type="spellStart"/>
-      <w:r>
-        <w:rPr>
-          <w:rFonts w:ascii="Times New Roman" w:hAnsi="Times New Roman" w:cs="Times New Roman"/>
-          <w:sz w:val="28"/>
-          <w:szCs w:val="28"/>
-        </w:rPr>
-        <w:t>access</w:t>
-      </w:r>
-      <w:proofErr w:type="spellEnd"/>
-      <w:r>
-        <w:rPr>
-          <w:rFonts w:ascii="Times New Roman" w:hAnsi="Times New Roman" w:cs="Times New Roman"/>
-          <w:sz w:val="28"/>
-          <w:szCs w:val="28"/>
-        </w:rPr>
-        <w:t xml:space="preserve"> и </w:t>
-      </w:r>
-      <w:proofErr w:type="spellStart"/>
-      <w:r>
-        <w:rPr>
-          <w:rFonts w:ascii="Times New Roman" w:hAnsi="Times New Roman" w:cs="Times New Roman"/>
-          <w:sz w:val="28"/>
-          <w:szCs w:val="28"/>
-        </w:rPr>
-        <w:t>refresh</w:t>
-      </w:r>
-      <w:proofErr w:type="spellEnd"/>
-      <w:r>
-        <w:rPr>
-          <w:rFonts w:ascii="Times New Roman" w:hAnsi="Times New Roman" w:cs="Times New Roman"/>
-          <w:sz w:val="28"/>
-          <w:szCs w:val="28"/>
-        </w:rPr>
-        <w:t xml:space="preserve"> токены).</w:t>
-      </w:r>
-    </w:p>
-    <w:p>
-      <w:pPr>
-        <w:spacing w:after="0" w:line="360" w:lineRule="auto"/>
-        <w:ind w:firstLine="709"/>
-        <w:jc w:val="both"/>
-        <w:rPr>
-          <w:rFonts w:ascii="Times New Roman" w:hAnsi="Times New Roman" w:cs="Times New Roman"/>
-          <w:sz w:val="28"/>
-          <w:szCs w:val="28"/>
-        </w:rPr>
-      </w:pPr>
-      <w:r>
-        <w:rPr>
-          <w:rFonts w:ascii="Times New Roman" w:hAnsi="Times New Roman" w:cs="Times New Roman"/>
-          <w:sz w:val="28"/>
-          <w:szCs w:val="28"/>
-        </w:rPr>
-        <w:t xml:space="preserve">- </w:t>
-      </w:r>
       <w:r>
         <w:rPr>
           <w:rFonts w:ascii="Times New Roman" w:hAnsi="Times New Roman" w:cs="Times New Roman"/>
@@ -2576,7 +2558,15 @@
           <w:szCs w:val="28"/>
           <w:lang w:val="en-US"/>
         </w:rPr>
-        <w:t>argon2</w:t>
+        <w:t>argon</w:t>
+      </w:r>
+      <w:r>
+        <w:rPr>
+          <w:rFonts w:ascii="Times New Roman" w:hAnsi="Times New Roman" w:cs="Times New Roman"/>
+          <w:sz w:val="28"/>
+          <w:szCs w:val="28"/>
+        </w:rPr>
+        <w:t>2</w:t>
       </w:r>
       <w:r>
         <w:rPr>

</xml_diff>